<commit_message>
Update Entregable N2 HabitatIA docx
</commit_message>
<xml_diff>
--- a/Entregable N2 HabitatIA .docx
+++ b/Entregable N2 HabitatIA .docx
@@ -565,539 +565,13 @@
       </w:r>
     </w:p>
     <w:p>
-      <w:pPr>
-        <w:pBdr>
-          <w:bottom w:color="c8922a" w:space="1" w:sz="8" w:val="single"/>
-        </w:pBdr>
-        <w:spacing w:after="600" w:lineRule="auto"/>
-        <w:ind w:left="1440" w:right="1440" w:firstLine="0"/>
-        <w:jc w:val="center"/>
-        <w:rPr/>
-      </w:pPr>
-      <w:r>
-        <w:rPr>
-          <w:rtl w:val="0"/>
-        </w:rPr>
-      </w:r>
-    </w:p>
-    <w:p>
-      <w:pPr>
-        <w:pBdr>
-          <w:bottom w:color="e2e8f0" w:space="4" w:sz="4" w:val="single"/>
-        </w:pBdr>
-        <w:spacing w:after="200" w:before="200" w:lineRule="auto"/>
-        <w:ind w:left="720" w:right="720" w:firstLine="0"/>
-        <w:jc w:val="left"/>
-        <w:rPr/>
-      </w:pPr>
-      <w:r>
-        <w:rPr>
-          <w:rFonts w:ascii="Calibri" w:cs="Calibri" w:eastAsia="Calibri" w:hAnsi="Calibri"/>
-          <w:b w:val="1"/>
-          <w:bCs w:val="1"/>
-          <w:color w:val="2a7f8f"/>
-          <w:sz w:val="40"/>
-          <w:szCs w:val="40"/>
-          <w:rtl w:val="0"/>
-        </w:rPr>
-        <w:t xml:space="preserve">1</w:t>
-      </w:r>
-      <w:r>
-        <w:rPr>
-          <w:rFonts w:ascii="Calibri" w:cs="Calibri" w:eastAsia="Calibri" w:hAnsi="Calibri"/>
-          <w:sz w:val="40"/>
-          <w:szCs w:val="40"/>
-          <w:rtl w:val="0"/>
-        </w:rPr>
-        <w:t xml:space="preserve">   </w:t>
-      </w:r>
-      <w:r>
-        <w:rPr>
-          <w:rFonts w:ascii="Calibri" w:cs="Calibri" w:eastAsia="Calibri" w:hAnsi="Calibri"/>
-          <w:color w:val="1b3a5c"/>
-          <w:sz w:val="36"/>
-          <w:szCs w:val="36"/>
-          <w:rtl w:val="0"/>
-        </w:rPr>
-        <w:t xml:space="preserve">Contexto e introducción</w:t>
-      </w:r>
-      <w:r>
-        <w:rPr>
-          <w:rtl w:val="0"/>
-        </w:rPr>
-      </w:r>
-    </w:p>
-    <w:p>
-      <w:pPr>
-        <w:pBdr>
-          <w:bottom w:color="e2e8f0" w:space="4" w:sz="4" w:val="single"/>
-        </w:pBdr>
-        <w:spacing w:after="200" w:before="200" w:lineRule="auto"/>
-        <w:ind w:left="720" w:right="720" w:firstLine="0"/>
-        <w:jc w:val="left"/>
-        <w:rPr/>
-      </w:pPr>
-      <w:r>
-        <w:rPr>
-          <w:rFonts w:ascii="Calibri" w:cs="Calibri" w:eastAsia="Calibri" w:hAnsi="Calibri"/>
-          <w:b w:val="1"/>
-          <w:bCs w:val="1"/>
-          <w:color w:val="2a7f8f"/>
-          <w:sz w:val="40"/>
-          <w:szCs w:val="40"/>
-          <w:rtl w:val="0"/>
-        </w:rPr>
-        <w:t xml:space="preserve">2</w:t>
-      </w:r>
-      <w:r>
-        <w:rPr>
-          <w:rFonts w:ascii="Calibri" w:cs="Calibri" w:eastAsia="Calibri" w:hAnsi="Calibri"/>
-          <w:sz w:val="40"/>
-          <w:szCs w:val="40"/>
-          <w:rtl w:val="0"/>
-        </w:rPr>
-        <w:t xml:space="preserve">   </w:t>
-      </w:r>
-      <w:r>
-        <w:rPr>
-          <w:rFonts w:ascii="Calibri" w:cs="Calibri" w:eastAsia="Calibri" w:hAnsi="Calibri"/>
-          <w:color w:val="1b3a5c"/>
-          <w:sz w:val="36"/>
-          <w:szCs w:val="36"/>
-          <w:rtl w:val="0"/>
-        </w:rPr>
-        <w:t xml:space="preserve">Problema, segmento y oportunidad</w:t>
-      </w:r>
-      <w:r>
-        <w:rPr>
-          <w:rtl w:val="0"/>
-        </w:rPr>
-      </w:r>
-    </w:p>
-    <w:p>
-      <w:pPr>
-        <w:pBdr>
-          <w:bottom w:color="e2e8f0" w:space="4" w:sz="4" w:val="single"/>
-        </w:pBdr>
-        <w:spacing w:after="200" w:before="200" w:lineRule="auto"/>
-        <w:ind w:left="720" w:right="720" w:firstLine="0"/>
-        <w:jc w:val="left"/>
-        <w:rPr/>
-      </w:pPr>
-      <w:r>
-        <w:rPr>
-          <w:rFonts w:ascii="Calibri" w:cs="Calibri" w:eastAsia="Calibri" w:hAnsi="Calibri"/>
-          <w:b w:val="1"/>
-          <w:bCs w:val="1"/>
-          <w:color w:val="2a7f8f"/>
-          <w:sz w:val="40"/>
-          <w:szCs w:val="40"/>
-          <w:rtl w:val="0"/>
-        </w:rPr>
-        <w:t xml:space="preserve">3</w:t>
-      </w:r>
-      <w:r>
-        <w:rPr>
-          <w:rFonts w:ascii="Calibri" w:cs="Calibri" w:eastAsia="Calibri" w:hAnsi="Calibri"/>
-          <w:sz w:val="40"/>
-          <w:szCs w:val="40"/>
-          <w:rtl w:val="0"/>
-        </w:rPr>
-        <w:t xml:space="preserve">   </w:t>
-      </w:r>
-      <w:r>
-        <w:rPr>
-          <w:rFonts w:ascii="Calibri" w:cs="Calibri" w:eastAsia="Calibri" w:hAnsi="Calibri"/>
-          <w:color w:val="1b3a5c"/>
-          <w:sz w:val="36"/>
-          <w:szCs w:val="36"/>
-          <w:rtl w:val="0"/>
-        </w:rPr>
-        <w:t xml:space="preserve">Validación y customer discovery, buyer persona</w:t>
-      </w:r>
-      <w:r>
-        <w:rPr>
-          <w:rtl w:val="0"/>
-        </w:rPr>
-      </w:r>
-    </w:p>
-    <w:p>
-      <w:pPr>
-        <w:pBdr>
-          <w:bottom w:color="e2e8f0" w:space="4" w:sz="4" w:val="single"/>
-        </w:pBdr>
-        <w:spacing w:after="200" w:before="200" w:lineRule="auto"/>
-        <w:ind w:left="720" w:right="720" w:firstLine="0"/>
-        <w:jc w:val="left"/>
-        <w:rPr/>
-      </w:pPr>
-      <w:r>
-        <w:rPr>
-          <w:rFonts w:ascii="Calibri" w:cs="Calibri" w:eastAsia="Calibri" w:hAnsi="Calibri"/>
-          <w:b w:val="1"/>
-          <w:bCs w:val="1"/>
-          <w:color w:val="2a7f8f"/>
-          <w:sz w:val="40"/>
-          <w:szCs w:val="40"/>
-          <w:rtl w:val="0"/>
-        </w:rPr>
-        <w:t xml:space="preserve">4</w:t>
-      </w:r>
-      <w:r>
-        <w:rPr>
-          <w:rFonts w:ascii="Calibri" w:cs="Calibri" w:eastAsia="Calibri" w:hAnsi="Calibri"/>
-          <w:sz w:val="40"/>
-          <w:szCs w:val="40"/>
-          <w:rtl w:val="0"/>
-        </w:rPr>
-        <w:t xml:space="preserve">   </w:t>
-      </w:r>
-      <w:r>
-        <w:rPr>
-          <w:rFonts w:ascii="Calibri" w:cs="Calibri" w:eastAsia="Calibri" w:hAnsi="Calibri"/>
-          <w:color w:val="1b3a5c"/>
-          <w:sz w:val="36"/>
-          <w:szCs w:val="36"/>
-          <w:rtl w:val="0"/>
-        </w:rPr>
-        <w:t xml:space="preserve">Enfoque general de solución</w:t>
-      </w:r>
-      <w:r>
-        <w:rPr>
-          <w:rtl w:val="0"/>
-        </w:rPr>
-      </w:r>
-    </w:p>
-    <w:p>
-      <w:pPr>
-        <w:pBdr>
-          <w:bottom w:color="e2e8f0" w:space="4" w:sz="4" w:val="single"/>
-        </w:pBdr>
-        <w:spacing w:after="200" w:before="200" w:lineRule="auto"/>
-        <w:ind w:left="720" w:right="720" w:firstLine="0"/>
-        <w:jc w:val="left"/>
-        <w:rPr/>
-      </w:pPr>
-      <w:r>
-        <w:rPr>
-          <w:rFonts w:ascii="Calibri" w:cs="Calibri" w:eastAsia="Calibri" w:hAnsi="Calibri"/>
-          <w:b w:val="1"/>
-          <w:bCs w:val="1"/>
-          <w:color w:val="2a7f8f"/>
-          <w:sz w:val="40"/>
-          <w:szCs w:val="40"/>
-          <w:rtl w:val="0"/>
-        </w:rPr>
-        <w:t xml:space="preserve">5</w:t>
-      </w:r>
-      <w:r>
-        <w:rPr>
-          <w:rFonts w:ascii="Calibri" w:cs="Calibri" w:eastAsia="Calibri" w:hAnsi="Calibri"/>
-          <w:sz w:val="40"/>
-          <w:szCs w:val="40"/>
-          <w:rtl w:val="0"/>
-        </w:rPr>
-        <w:t xml:space="preserve">   </w:t>
-      </w:r>
-      <w:r>
-        <w:rPr>
-          <w:rFonts w:ascii="Calibri" w:cs="Calibri" w:eastAsia="Calibri" w:hAnsi="Calibri"/>
-          <w:color w:val="1b3a5c"/>
-          <w:sz w:val="36"/>
-          <w:szCs w:val="36"/>
-          <w:rtl w:val="0"/>
-        </w:rPr>
-        <w:t xml:space="preserve">Propuesta de valor</w:t>
-      </w:r>
-      <w:r>
-        <w:rPr>
-          <w:rtl w:val="0"/>
-        </w:rPr>
-      </w:r>
-    </w:p>
-    <w:p>
-      <w:pPr>
-        <w:pBdr>
-          <w:bottom w:color="e2e8f0" w:space="4" w:sz="4" w:val="single"/>
-        </w:pBdr>
-        <w:spacing w:after="200" w:before="200" w:lineRule="auto"/>
-        <w:ind w:left="720" w:right="720" w:firstLine="0"/>
-        <w:jc w:val="left"/>
-        <w:rPr/>
-      </w:pPr>
-      <w:r>
-        <w:rPr>
-          <w:rFonts w:ascii="Calibri" w:cs="Calibri" w:eastAsia="Calibri" w:hAnsi="Calibri"/>
-          <w:b w:val="1"/>
-          <w:bCs w:val="1"/>
-          <w:color w:val="2a7f8f"/>
-          <w:sz w:val="40"/>
-          <w:szCs w:val="40"/>
-          <w:rtl w:val="0"/>
-        </w:rPr>
-        <w:t xml:space="preserve">6</w:t>
-      </w:r>
-      <w:r>
-        <w:rPr>
-          <w:rFonts w:ascii="Calibri" w:cs="Calibri" w:eastAsia="Calibri" w:hAnsi="Calibri"/>
-          <w:sz w:val="40"/>
-          <w:szCs w:val="40"/>
-          <w:rtl w:val="0"/>
-        </w:rPr>
-        <w:t xml:space="preserve">   </w:t>
-      </w:r>
-      <w:r>
-        <w:rPr>
-          <w:rFonts w:ascii="Calibri" w:cs="Calibri" w:eastAsia="Calibri" w:hAnsi="Calibri"/>
-          <w:color w:val="1b3a5c"/>
-          <w:sz w:val="36"/>
-          <w:szCs w:val="36"/>
-          <w:rtl w:val="0"/>
-        </w:rPr>
-        <w:t xml:space="preserve">Dimensionamiento de la oportunidad y del mercado</w:t>
-      </w:r>
-      <w:r>
-        <w:rPr>
-          <w:rtl w:val="0"/>
-        </w:rPr>
-      </w:r>
-    </w:p>
-    <w:p>
-      <w:pPr>
-        <w:pBdr>
-          <w:bottom w:color="e2e8f0" w:space="4" w:sz="4" w:val="single"/>
-        </w:pBdr>
-        <w:spacing w:after="200" w:before="200" w:lineRule="auto"/>
-        <w:ind w:left="720" w:right="720" w:firstLine="0"/>
-        <w:jc w:val="left"/>
-        <w:rPr/>
-      </w:pPr>
-      <w:r>
-        <w:rPr>
-          <w:rFonts w:ascii="Calibri" w:cs="Calibri" w:eastAsia="Calibri" w:hAnsi="Calibri"/>
-          <w:b w:val="1"/>
-          <w:bCs w:val="1"/>
-          <w:color w:val="2a7f8f"/>
-          <w:sz w:val="40"/>
-          <w:szCs w:val="40"/>
-          <w:rtl w:val="0"/>
-        </w:rPr>
-        <w:t xml:space="preserve">7</w:t>
-      </w:r>
-      <w:r>
-        <w:rPr>
-          <w:rFonts w:ascii="Calibri" w:cs="Calibri" w:eastAsia="Calibri" w:hAnsi="Calibri"/>
-          <w:sz w:val="40"/>
-          <w:szCs w:val="40"/>
-          <w:rtl w:val="0"/>
-        </w:rPr>
-        <w:t xml:space="preserve">   </w:t>
-      </w:r>
-      <w:r>
-        <w:rPr>
-          <w:rFonts w:ascii="Calibri" w:cs="Calibri" w:eastAsia="Calibri" w:hAnsi="Calibri"/>
-          <w:color w:val="1b3a5c"/>
-          <w:sz w:val="36"/>
-          <w:szCs w:val="36"/>
-          <w:rtl w:val="0"/>
-        </w:rPr>
-        <w:t xml:space="preserve">Productos y servicios</w:t>
-      </w:r>
-      <w:r>
-        <w:rPr>
-          <w:rtl w:val="0"/>
-        </w:rPr>
-      </w:r>
-    </w:p>
-    <w:p>
-      <w:pPr>
-        <w:pBdr>
-          <w:bottom w:color="e2e8f0" w:space="4" w:sz="4" w:val="single"/>
-        </w:pBdr>
-        <w:spacing w:after="200" w:before="200" w:lineRule="auto"/>
-        <w:ind w:left="720" w:right="720" w:firstLine="0"/>
-        <w:jc w:val="left"/>
-        <w:rPr/>
-      </w:pPr>
-      <w:r>
-        <w:rPr>
-          <w:rFonts w:ascii="Calibri" w:cs="Calibri" w:eastAsia="Calibri" w:hAnsi="Calibri"/>
-          <w:b w:val="1"/>
-          <w:bCs w:val="1"/>
-          <w:color w:val="2a7f8f"/>
-          <w:sz w:val="40"/>
-          <w:szCs w:val="40"/>
-          <w:rtl w:val="0"/>
-        </w:rPr>
-        <w:t xml:space="preserve">8</w:t>
-      </w:r>
-      <w:r>
-        <w:rPr>
-          <w:rFonts w:ascii="Calibri" w:cs="Calibri" w:eastAsia="Calibri" w:hAnsi="Calibri"/>
-          <w:sz w:val="40"/>
-          <w:szCs w:val="40"/>
-          <w:rtl w:val="0"/>
-        </w:rPr>
-        <w:t xml:space="preserve">   </w:t>
-      </w:r>
-      <w:r>
-        <w:rPr>
-          <w:rFonts w:ascii="Calibri" w:cs="Calibri" w:eastAsia="Calibri" w:hAnsi="Calibri"/>
-          <w:color w:val="1b3a5c"/>
-          <w:sz w:val="36"/>
-          <w:szCs w:val="36"/>
-          <w:rtl w:val="0"/>
-        </w:rPr>
-        <w:t xml:space="preserve">Entorno competitivo</w:t>
-      </w:r>
-      <w:r>
-        <w:rPr>
-          <w:rtl w:val="0"/>
-        </w:rPr>
-      </w:r>
-    </w:p>
-    <w:p>
-      <w:pPr>
-        <w:pBdr>
-          <w:bottom w:color="e2e8f0" w:space="4" w:sz="4" w:val="single"/>
-        </w:pBdr>
-        <w:spacing w:after="200" w:before="200" w:lineRule="auto"/>
-        <w:ind w:left="720" w:right="720" w:firstLine="0"/>
-        <w:jc w:val="left"/>
-        <w:rPr/>
-      </w:pPr>
-      <w:r>
-        <w:rPr>
-          <w:rFonts w:ascii="Calibri" w:cs="Calibri" w:eastAsia="Calibri" w:hAnsi="Calibri"/>
-          <w:b w:val="1"/>
-          <w:bCs w:val="1"/>
-          <w:color w:val="2a7f8f"/>
-          <w:sz w:val="40"/>
-          <w:szCs w:val="40"/>
-          <w:rtl w:val="0"/>
-        </w:rPr>
-        <w:t xml:space="preserve">9</w:t>
-      </w:r>
-      <w:r>
-        <w:rPr>
-          <w:rFonts w:ascii="Calibri" w:cs="Calibri" w:eastAsia="Calibri" w:hAnsi="Calibri"/>
-          <w:sz w:val="40"/>
-          <w:szCs w:val="40"/>
-          <w:rtl w:val="0"/>
-        </w:rPr>
-        <w:t xml:space="preserve">   </w:t>
-      </w:r>
-      <w:r>
-        <w:rPr>
-          <w:rFonts w:ascii="Calibri" w:cs="Calibri" w:eastAsia="Calibri" w:hAnsi="Calibri"/>
-          <w:color w:val="1b3a5c"/>
-          <w:sz w:val="36"/>
-          <w:szCs w:val="36"/>
-          <w:rtl w:val="0"/>
-        </w:rPr>
-        <w:t xml:space="preserve">Plan comercial físico y digital</w:t>
-      </w:r>
-      <w:r>
-        <w:rPr>
-          <w:rtl w:val="0"/>
-        </w:rPr>
-      </w:r>
-    </w:p>
-    <w:p>
-      <w:pPr>
-        <w:pBdr>
-          <w:bottom w:color="e2e8f0" w:space="4" w:sz="4" w:val="single"/>
-        </w:pBdr>
-        <w:spacing w:after="200" w:before="200" w:lineRule="auto"/>
-        <w:ind w:left="720" w:right="720" w:firstLine="0"/>
-        <w:jc w:val="left"/>
-        <w:rPr/>
-      </w:pPr>
-      <w:r>
-        <w:rPr>
-          <w:rFonts w:ascii="Calibri" w:cs="Calibri" w:eastAsia="Calibri" w:hAnsi="Calibri"/>
-          <w:b w:val="1"/>
-          <w:bCs w:val="1"/>
-          <w:color w:val="2a7f8f"/>
-          <w:sz w:val="40"/>
-          <w:szCs w:val="40"/>
-          <w:rtl w:val="0"/>
-        </w:rPr>
-        <w:t xml:space="preserve">10</w:t>
-      </w:r>
-      <w:r>
-        <w:rPr>
-          <w:rFonts w:ascii="Calibri" w:cs="Calibri" w:eastAsia="Calibri" w:hAnsi="Calibri"/>
-          <w:sz w:val="40"/>
-          <w:szCs w:val="40"/>
-          <w:rtl w:val="0"/>
-        </w:rPr>
-        <w:t xml:space="preserve">   </w:t>
-      </w:r>
-      <w:r>
-        <w:rPr>
-          <w:rFonts w:ascii="Calibri" w:cs="Calibri" w:eastAsia="Calibri" w:hAnsi="Calibri"/>
-          <w:color w:val="1b3a5c"/>
-          <w:sz w:val="36"/>
-          <w:szCs w:val="36"/>
-          <w:rtl w:val="0"/>
-        </w:rPr>
-        <w:t xml:space="preserve">Comentarios finales y conclusiones</w:t>
-      </w:r>
-      <w:r>
-        <w:rPr>
-          <w:rtl w:val="0"/>
-        </w:rPr>
-      </w:r>
-    </w:p>
-    <w:p>
-      <w:pPr>
-        <w:pBdr>
-          <w:bottom w:color="e2e8f0" w:space="4" w:sz="4" w:val="single"/>
-        </w:pBdr>
-        <w:spacing w:after="200" w:before="200" w:lineRule="auto"/>
-        <w:ind w:left="720" w:right="720" w:firstLine="0"/>
-        <w:jc w:val="left"/>
-        <w:rPr/>
-      </w:pPr>
-      <w:r>
-        <w:rPr>
-          <w:rFonts w:ascii="Calibri" w:cs="Calibri" w:eastAsia="Calibri" w:hAnsi="Calibri"/>
-          <w:b w:val="1"/>
-          <w:bCs w:val="1"/>
-          <w:color w:val="2a7f8f"/>
-          <w:sz w:val="40"/>
-          <w:szCs w:val="40"/>
-          <w:rtl w:val="0"/>
-        </w:rPr>
-        <w:t xml:space="preserve">11</w:t>
-      </w:r>
-      <w:r>
-        <w:rPr>
-          <w:rFonts w:ascii="Calibri" w:cs="Calibri" w:eastAsia="Calibri" w:hAnsi="Calibri"/>
-          <w:sz w:val="40"/>
-          <w:szCs w:val="40"/>
-          <w:rtl w:val="0"/>
-        </w:rPr>
-        <w:t xml:space="preserve">   </w:t>
-      </w:r>
-      <w:r>
-        <w:rPr>
-          <w:color w:val="1b3a5c"/>
-          <w:sz w:val="36"/>
-          <w:szCs w:val="36"/>
-          <w:rtl w:val="0"/>
-        </w:rPr>
-        <w:t xml:space="preserve">Anexos</w:t>
-      </w:r>
-      <w:r>
-        <w:br w:type="page"/>
-      </w:r>
-      <w:r>
-        <w:rPr>
-          <w:rtl w:val="0"/>
-        </w:rPr>
-      </w:r>
+      <w:fldChar w:fldCharType="begin"/>
+      <w:instrText xml:space="preserve">TOC \o "1-3" \h \z \u</w:instrText>
+      <w:fldChar w:fldCharType="separate"/>
+      <w:r>
+        <w:t>Actualizá este campo en Word para refrescar el índice.</w:t>
+      </w:r>
+      <w:fldChar w:fldCharType="end"/>
     </w:p>
     <w:p>
       <w:pPr>
@@ -32247,12 +31721,31 @@
     </w:p>
     <w:sectPr>
       <w:headerReference r:id="rId26" w:type="default"/>
+      <w:footerReference w:type="default" r:id="rId27"/>
       <w:pgSz w:h="16838" w:w="11906" w:orient="portrait"/>
       <w:pgMar w:bottom="1134" w:top="1134" w:left="1134" w:right="1134" w:header="708" w:footer="708"/>
       <w:pgNumType w:start="1"/>
     </w:sectPr>
   </w:body>
 </w:document>
+</file>
+
+<file path=word/footer1.xml><?xml version="1.0" encoding="utf-8"?>
+<w:ftr xmlns:m="http://schemas.openxmlformats.org/officeDocument/2006/math" xmlns:mc="http://schemas.openxmlformats.org/markup-compatibility/2006" xmlns:mo="http://schemas.microsoft.com/office/mac/office/2008/main" xmlns:mv="urn:schemas-microsoft-com:mac:vml" xmlns:o="urn:schemas-microsoft-com:office:office" xmlns:r="http://schemas.openxmlformats.org/officeDocument/2006/relationships" xmlns:v="urn:schemas-microsoft-com:vml" xmlns:w10="urn:schemas-microsoft-com:office:word" xmlns:w14="http://schemas.microsoft.com/office/word/2010/wordml" xmlns:w="http://schemas.openxmlformats.org/wordprocessingml/2006/main" xmlns:wne="http://schemas.microsoft.com/office/word/2006/wordml" xmlns:wp14="http://schemas.microsoft.com/office/word/2010/wordprocessingDrawing" xmlns:wp="http://schemas.openxmlformats.org/drawingml/2006/wordprocessingDrawing" xmlns:wpc="http://schemas.microsoft.com/office/word/2010/wordprocessingCanvas" xmlns:wpg="http://schemas.microsoft.com/office/word/2010/wordprocessingGroup" xmlns:wpi="http://schemas.microsoft.com/office/word/2010/wordprocessingInk" xmlns:wps="http://schemas.microsoft.com/office/word/2010/wordprocessingShape" mc:Ignorable="w14 wp14">
+  <w:p>
+    <w:pPr>
+      <w:pStyle w:val="Footer"/>
+      <w:jc w:val="center"/>
+    </w:pPr>
+    <w:fldChar w:fldCharType="begin"/>
+    <w:instrText xml:space="preserve"> PAGE </w:instrText>
+    <w:fldChar w:fldCharType="separate"/>
+    <w:r>
+      <w:t>1</w:t>
+    </w:r>
+    <w:fldChar w:fldCharType="end"/>
+  </w:p>
+</w:ftr>
 </file>
 
 <file path=word/header1.xml><?xml version="1.0" encoding="utf-8"?>

</xml_diff>

<commit_message>
Add executive report to HabitatIA deliverable
</commit_message>
<xml_diff>
--- a/Entregable N2 HabitatIA .docx
+++ b/Entregable N2 HabitatIA .docx
@@ -1,6 +1,6 @@
 
 <file path=word/document.xml><?xml version="1.0" encoding="utf-8"?>
-<w:document xmlns:mc="http://schemas.openxmlformats.org/markup-compatibility/2006" xmlns:o="urn:schemas-microsoft-com:office:office" xmlns:r="http://schemas.openxmlformats.org/officeDocument/2006/relationships" xmlns:m="http://schemas.openxmlformats.org/officeDocument/2006/math" xmlns:v="urn:schemas-microsoft-com:vml" xmlns:wp="http://schemas.openxmlformats.org/drawingml/2006/wordprocessingDrawing" xmlns:w10="urn:schemas-microsoft-com:office:word" xmlns:w="http://schemas.openxmlformats.org/wordprocessingml/2006/main" xmlns:wne="http://schemas.microsoft.com/office/word/2006/wordml" xmlns:sl="http://schemas.openxmlformats.org/schemaLibrary/2006/main" xmlns:a="http://schemas.openxmlformats.org/drawingml/2006/main" xmlns:pic="http://schemas.openxmlformats.org/drawingml/2006/picture" xmlns:c="http://schemas.openxmlformats.org/drawingml/2006/chart" xmlns:lc="http://schemas.openxmlformats.org/drawingml/2006/lockedCanvas" xmlns:dgm="http://schemas.openxmlformats.org/drawingml/2006/diagram" xmlns:wps="http://schemas.microsoft.com/office/word/2010/wordprocessingShape" xmlns:wpg="http://schemas.microsoft.com/office/word/2010/wordprocessingGroup" xmlns:w14="http://schemas.microsoft.com/office/word/2010/wordml" xmlns:w15="http://schemas.microsoft.com/office/word/2012/wordml" xmlns:w16="http://schemas.microsoft.com/office/word/2018/wordml" xmlns:w16cex="http://schemas.microsoft.com/office/word/2018/wordml/cex" xmlns:w16cid="http://schemas.microsoft.com/office/word/2016/wordml/cid" xmlns="http://schemas.microsoft.com/office/tasks/2019/documenttasks" xmlns:cr="http://schemas.microsoft.com/office/comments/2020/reactions">
+<w:document xmlns:ns2="http://schemas.openxmlformats.org/drawingml/2006/wordprocessingDrawing" xmlns:ns3="http://schemas.openxmlformats.org/drawingml/2006/main" xmlns:ns4="http://schemas.openxmlformats.org/drawingml/2006/picture" xmlns:ns5="http://schemas.openxmlformats.org/officeDocument/2006/relationships" xmlns:w="http://schemas.openxmlformats.org/wordprocessingml/2006/main" xmlns:w14="http://schemas.microsoft.com/office/word/2010/wordml">
   <w:body>
     <w:p>
       <w:pPr>
@@ -100,36 +100,36 @@
           <w:szCs w:val="88"/>
         </w:rPr>
         <w:drawing>
-          <wp:inline distB="114300" distT="114300" distL="114300" distR="114300">
-            <wp:extent cx="1375154" cy="1133126"/>
-            <wp:effectExtent b="0" l="0" r="0" t="0"/>
-            <wp:docPr id="6" name="image5.png"/>
-            <a:graphic>
-              <a:graphicData uri="http://schemas.openxmlformats.org/drawingml/2006/picture">
-                <pic:pic>
-                  <pic:nvPicPr>
-                    <pic:cNvPr id="0" name="image5.png"/>
-                    <pic:cNvPicPr preferRelativeResize="0"/>
-                  </pic:nvPicPr>
-                  <pic:blipFill>
-                    <a:blip r:embed="rId6"/>
-                    <a:srcRect b="0" l="0" r="0" t="0"/>
-                    <a:stretch>
-                      <a:fillRect/>
-                    </a:stretch>
-                  </pic:blipFill>
-                  <pic:spPr>
-                    <a:xfrm>
-                      <a:off x="0" y="0"/>
-                      <a:ext cx="1375154" cy="1133126"/>
-                    </a:xfrm>
-                    <a:prstGeom prst="rect"/>
-                    <a:ln/>
-                  </pic:spPr>
-                </pic:pic>
-              </a:graphicData>
-            </a:graphic>
-          </wp:inline>
+          <ns2:inline distB="114300" distT="114300" distL="114300" distR="114300">
+            <ns2:extent cx="1375154" cy="1133126"/>
+            <ns2:effectExtent b="0" l="0" r="0" t="0"/>
+            <ns2:docPr id="6" name="image5.png"/>
+            <ns3:graphic>
+              <ns3:graphicData uri="http://schemas.openxmlformats.org/drawingml/2006/picture">
+                <ns4:pic>
+                  <ns4:nvPicPr>
+                    <ns4:cNvPr id="0" name="image5.png"/>
+                    <ns4:cNvPicPr preferRelativeResize="0"/>
+                  </ns4:nvPicPr>
+                  <ns4:blipFill>
+                    <ns3:blip ns5:embed="rId6"/>
+                    <ns3:srcRect b="0" l="0" r="0" t="0"/>
+                    <ns3:stretch>
+                      <ns3:fillRect/>
+                    </ns3:stretch>
+                  </ns4:blipFill>
+                  <ns4:spPr>
+                    <ns3:xfrm>
+                      <ns3:off x="0" y="0"/>
+                      <ns3:ext cx="1375154" cy="1133126"/>
+                    </ns3:xfrm>
+                    <ns3:prstGeom prst="rect"/>
+                    <ns3:ln/>
+                  </ns4:spPr>
+                </ns4:pic>
+              </ns3:graphicData>
+            </ns3:graphic>
+          </ns2:inline>
         </w:drawing>
       </w:r>
       <w:r>
@@ -145,44 +145,44 @@
       </w:r>
       <w:r>
         <w:drawing>
-          <wp:anchor allowOverlap="1" behindDoc="0" distB="114300" distT="114300" distL="114300" distR="114300" hidden="0" layoutInCell="1" locked="0" relativeHeight="0" simplePos="0">
-            <wp:simplePos x="0" y="0"/>
-            <wp:positionH relativeFrom="column">
-              <wp:posOffset>1359698</wp:posOffset>
-            </wp:positionH>
-            <wp:positionV relativeFrom="paragraph">
-              <wp:posOffset>1657350</wp:posOffset>
-            </wp:positionV>
-            <wp:extent cx="3399371" cy="990251"/>
-            <wp:effectExtent b="0" l="0" r="0" t="0"/>
-            <wp:wrapSquare wrapText="bothSides" distB="114300" distT="114300" distL="114300" distR="114300"/>
-            <wp:docPr id="19" name="image13.png"/>
-            <a:graphic>
-              <a:graphicData uri="http://schemas.openxmlformats.org/drawingml/2006/picture">
-                <pic:pic>
-                  <pic:nvPicPr>
-                    <pic:cNvPr id="0" name="image13.png"/>
-                    <pic:cNvPicPr preferRelativeResize="0"/>
-                  </pic:nvPicPr>
-                  <pic:blipFill>
-                    <a:blip r:embed="rId7"/>
-                    <a:srcRect b="36881" l="0" r="0" t="33558"/>
-                    <a:stretch>
-                      <a:fillRect/>
-                    </a:stretch>
-                  </pic:blipFill>
-                  <pic:spPr>
-                    <a:xfrm>
-                      <a:off x="0" y="0"/>
-                      <a:ext cx="3399371" cy="990251"/>
-                    </a:xfrm>
-                    <a:prstGeom prst="rect"/>
-                    <a:ln/>
-                  </pic:spPr>
-                </pic:pic>
-              </a:graphicData>
-            </a:graphic>
-          </wp:anchor>
+          <ns2:anchor allowOverlap="1" behindDoc="0" distB="114300" distT="114300" distL="114300" distR="114300" hidden="0" layoutInCell="1" locked="0" relativeHeight="0" simplePos="0">
+            <ns2:simplePos x="0" y="0"/>
+            <ns2:positionH relativeFrom="column">
+              <ns2:posOffset>1359698</ns2:posOffset>
+            </ns2:positionH>
+            <ns2:positionV relativeFrom="paragraph">
+              <ns2:posOffset>1657350</ns2:posOffset>
+            </ns2:positionV>
+            <ns2:extent cx="3399371" cy="990251"/>
+            <ns2:effectExtent b="0" l="0" r="0" t="0"/>
+            <ns2:wrapSquare wrapText="bothSides" distB="114300" distT="114300" distL="114300" distR="114300"/>
+            <ns2:docPr id="19" name="image13.png"/>
+            <ns3:graphic>
+              <ns3:graphicData uri="http://schemas.openxmlformats.org/drawingml/2006/picture">
+                <ns4:pic>
+                  <ns4:nvPicPr>
+                    <ns4:cNvPr id="0" name="image13.png"/>
+                    <ns4:cNvPicPr preferRelativeResize="0"/>
+                  </ns4:nvPicPr>
+                  <ns4:blipFill>
+                    <ns3:blip ns5:embed="rId7"/>
+                    <ns3:srcRect b="36881" l="0" r="0" t="33558"/>
+                    <ns3:stretch>
+                      <ns3:fillRect/>
+                    </ns3:stretch>
+                  </ns4:blipFill>
+                  <ns4:spPr>
+                    <ns3:xfrm>
+                      <ns3:off x="0" y="0"/>
+                      <ns3:ext cx="3399371" cy="990251"/>
+                    </ns3:xfrm>
+                    <ns3:prstGeom prst="rect"/>
+                    <ns3:ln/>
+                  </ns4:spPr>
+                </ns4:pic>
+              </ns3:graphicData>
+            </ns3:graphic>
+          </ns2:anchor>
         </w:drawing>
       </w:r>
     </w:p>
@@ -853,6 +853,326 @@
           <w:rFonts w:ascii="Calibri" w:cs="Calibri" w:eastAsia="Calibri" w:hAnsi="Calibri"/>
           <w:b w:val="1"/>
           <w:bCs w:val="1"/>
+          <w:color w:val="ffffff"/>
+          <w:sz w:val="40"/>
+          <w:szCs w:val="40"/>
+          <w:rtl w:val="0"/>
+        </w:rPr>
+        <w:t xml:space="preserve">Informe ejecutivo</w:t>
+      </w:r>
+      <w:r>
+        <w:rPr>
+          <w:rtl w:val="0"/>
+        </w:rPr>
+      </w:r>
+    </w:p>
+    <w:p>
+      <w:pPr>
+        <w:pStyle w:val="Heading2"/>
+        <w:spacing w:line="240" w:lineRule="auto"/>
+        <w:rPr/>
+      </w:pPr>
+      <w:r>
+        <w:rPr>
+          <w:rFonts w:ascii="Calibri" w:cs="Calibri" w:eastAsia="Calibri" w:hAnsi="Calibri"/>
+          <w:b w:val="1"/>
+          <w:bCs w:val="1"/>
+          <w:color w:val="1b3a5c"/>
+          <w:sz w:val="32"/>
+          <w:szCs w:val="32"/>
+          <w:rtl w:val="0"/>
+        </w:rPr>
+        <w:t xml:space="preserve">Panorama general y tesis del proyecto</w:t>
+      </w:r>
+      <w:r>
+        <w:rPr>
+          <w:rtl w:val="0"/>
+        </w:rPr>
+      </w:r>
+    </w:p>
+    <w:p>
+      <w:pPr>
+        <w:spacing w:after="200" w:before="0" w:line="240" w:lineRule="auto"/>
+        <w:rPr/>
+      </w:pPr>
+      <w:r>
+        <w:rPr>
+          <w:rFonts w:ascii="Calibri" w:cs="Calibri" w:eastAsia="Calibri" w:hAnsi="Calibri"/>
+          <w:b w:val="0"/>
+          <w:bCs w:val="0"/>
+          <w:i w:val="0"/>
+          <w:iCs w:val="0"/>
+          <w:color w:val="1a1a2e"/>
+          <w:sz w:val="26"/>
+          <w:szCs w:val="26"/>
+          <w:rtl w:val="0"/>
+        </w:rPr>
+        <w:t xml:space="preserve">HabitatIA propone intervenir en una etapa del proceso habitacional que suele estar desordenada, fragmentada y cargada de incertidumbre: el momento previo a construir, ampliar o remodelar una vivienda. En ese tramo inicial, muchas personas tienen una necesidad concreta, un presupuesto aproximado y expectativas sobre cómo quieren vivir, pero no cuentan con una herramienta accesible que les permita traducir esa intención en una propuesta visual, funcional y económicamente comprensible. El resultado habitual es la postergación de decisiones, la sensación de estar entrando en un terreno técnico opaco y la pérdida de oportunidades de planificación. HabitatIA nace para ordenar ese primer paso y transformarlo en una experiencia más clara, guiada y accionable.</w:t>
+      </w:r>
+      <w:r>
+        <w:rPr>
+          <w:rtl w:val="0"/>
+        </w:rPr>
+      </w:r>
+    </w:p>
+    <w:p>
+      <w:pPr>
+        <w:spacing w:after="200" w:before="0" w:line="240" w:lineRule="auto"/>
+        <w:rPr/>
+      </w:pPr>
+      <w:r>
+        <w:rPr>
+          <w:rFonts w:ascii="Calibri" w:cs="Calibri" w:eastAsia="Calibri" w:hAnsi="Calibri"/>
+          <w:b w:val="0"/>
+          <w:bCs w:val="0"/>
+          <w:i w:val="0"/>
+          <w:iCs w:val="0"/>
+          <w:color w:val="1a1a2e"/>
+          <w:sz w:val="26"/>
+          <w:szCs w:val="26"/>
+          <w:rtl w:val="0"/>
+        </w:rPr>
+        <w:t xml:space="preserve">La relevancia de esta propuesta no surge solamente de la dificultad de acceso a la vivienda, sino también del modo en que se toman las decisiones alrededor de ella. Construir suele vivirse como una combinación de deseo, ansiedad e información incompleta. Quien quiere avanzar necesita entender qué podría hacer con sus recursos, cómo se vería, qué materiales implicaría, qué rango de costos debería esperar y dónde existirían márgenes concretos de ahorro. HabitatIA busca reducir esa asimetría mediante una lógica de traducción: convertir inputs simples del usuario en una propuesta preliminar con visualización, criterios espaciales, estimación de materiales y lectura económica inicial. En términos estratégicos, no se presenta como un generador de renders, sino como una infraestructura de comprensión para una decisión compleja.</w:t>
+      </w:r>
+      <w:r>
+        <w:rPr>
+          <w:rtl w:val="0"/>
+        </w:rPr>
+      </w:r>
+    </w:p>
+    <w:p>
+      <w:pPr>
+        <w:pStyle w:val="Heading2"/>
+        <w:spacing w:line="240" w:lineRule="auto"/>
+        <w:rPr/>
+      </w:pPr>
+      <w:r>
+        <w:rPr>
+          <w:rFonts w:ascii="Calibri" w:cs="Calibri" w:eastAsia="Calibri" w:hAnsi="Calibri"/>
+          <w:b w:val="1"/>
+          <w:bCs w:val="1"/>
+          <w:color w:val="1b3a5c"/>
+          <w:sz w:val="32"/>
+          <w:szCs w:val="32"/>
+          <w:rtl w:val="0"/>
+        </w:rPr>
+        <w:t xml:space="preserve">Propuesta de valor y diferenciación</w:t>
+      </w:r>
+      <w:r>
+        <w:rPr>
+          <w:rtl w:val="0"/>
+        </w:rPr>
+      </w:r>
+    </w:p>
+    <w:p>
+      <w:pPr>
+        <w:spacing w:after="200" w:before="0" w:line="240" w:lineRule="auto"/>
+        <w:rPr/>
+      </w:pPr>
+      <w:r>
+        <w:rPr>
+          <w:rFonts w:ascii="Calibri" w:cs="Calibri" w:eastAsia="Calibri" w:hAnsi="Calibri"/>
+          <w:b w:val="0"/>
+          <w:bCs w:val="0"/>
+          <w:i w:val="0"/>
+          <w:iCs w:val="0"/>
+          <w:color w:val="1a1a2e"/>
+          <w:sz w:val="26"/>
+          <w:szCs w:val="26"/>
+          <w:rtl w:val="0"/>
+        </w:rPr>
+        <w:t xml:space="preserve">El diferencial central del proyecto está en integrar dos problemas que normalmente se abordan por separado. Por un lado, la falta de claridad de las personas que quieren proyectar una vivienda o una ampliación; por otro, la existencia de materiales sobrantes de obras que conservan valor de uso, pero no circulan de forma ordenada. HabitatIA une ambas dimensiones dentro de una misma experiencia. La plataforma no solo ayuda a imaginar y presupuestar, sino que además identifica qué parte de los materiales necesarios podría obtenerse a mejor precio mediante un marketplace de remanentes reutilizables. Esa integración agrega valor económico, ambiental y operativo al mismo tiempo.</w:t>
+      </w:r>
+      <w:r>
+        <w:rPr>
+          <w:rtl w:val="0"/>
+        </w:rPr>
+      </w:r>
+    </w:p>
+    <w:p>
+      <w:pPr>
+        <w:spacing w:after="200" w:before="0" w:line="240" w:lineRule="auto"/>
+        <w:rPr/>
+      </w:pPr>
+      <w:r>
+        <w:rPr>
+          <w:rFonts w:ascii="Calibri" w:cs="Calibri" w:eastAsia="Calibri" w:hAnsi="Calibri"/>
+          <w:b w:val="0"/>
+          <w:bCs w:val="0"/>
+          <w:i w:val="0"/>
+          <w:iCs w:val="0"/>
+          <w:color w:val="1a1a2e"/>
+          <w:sz w:val="26"/>
+          <w:szCs w:val="26"/>
+          <w:rtl w:val="0"/>
+        </w:rPr>
+        <w:t xml:space="preserve">Desde la perspectiva del usuario final, la propuesta de valor consiste en transformar una decisión difusa en una hoja de ruta más entendible. Desde la perspectiva de quienes tienen sobrantes de materiales, la plataforma abre un canal más eficiente para monetizar stock inmovilizado. Y desde una mirada de ecosistema, HabitatIA incorpora una lógica de circularidad que mejora la asignación de recursos dentro del sector. Esta combinación le permite construir una identidad más robusta que la de una solución puramente estética o puramente transaccional: es una herramienta de planificación asistida con impacto económico tangible.</w:t>
+      </w:r>
+      <w:r>
+        <w:rPr>
+          <w:rtl w:val="0"/>
+        </w:rPr>
+      </w:r>
+    </w:p>
+    <w:p>
+      <w:pPr>
+        <w:pStyle w:val="Heading2"/>
+        <w:spacing w:line="240" w:lineRule="auto"/>
+        <w:rPr/>
+      </w:pPr>
+      <w:r>
+        <w:rPr>
+          <w:rFonts w:ascii="Calibri" w:cs="Calibri" w:eastAsia="Calibri" w:hAnsi="Calibri"/>
+          <w:b w:val="1"/>
+          <w:bCs w:val="1"/>
+          <w:color w:val="1b3a5c"/>
+          <w:sz w:val="32"/>
+          <w:szCs w:val="32"/>
+          <w:rtl w:val="0"/>
+        </w:rPr>
+        <w:t xml:space="preserve">Viabilidad de negocio y lógica de crecimiento</w:t>
+      </w:r>
+      <w:r>
+        <w:rPr>
+          <w:rtl w:val="0"/>
+        </w:rPr>
+      </w:r>
+    </w:p>
+    <w:p>
+      <w:pPr>
+        <w:spacing w:after="200" w:before="0" w:line="240" w:lineRule="auto"/>
+        <w:rPr/>
+      </w:pPr>
+      <w:r>
+        <w:rPr>
+          <w:rFonts w:ascii="Calibri" w:cs="Calibri" w:eastAsia="Calibri" w:hAnsi="Calibri"/>
+          <w:b w:val="0"/>
+          <w:bCs w:val="0"/>
+          <w:i w:val="0"/>
+          <w:iCs w:val="0"/>
+          <w:color w:val="1a1a2e"/>
+          <w:sz w:val="26"/>
+          <w:szCs w:val="26"/>
+          <w:rtl w:val="0"/>
+        </w:rPr>
+        <w:t xml:space="preserve">El modelo de negocio planteado es consistente con una estrategia escalonada de desarrollo. En una primera capa, HabitatIA puede capturar valor a través de funcionalidades premium ligadas a mayor profundidad de análisis, personalización o detalle de la propuesta habitacional. En una segunda capa, la plataforma puede monetizar mediante una comisión sobre operaciones concretadas dentro del marketplace de materiales. Esta lógica de doble captura es atractiva porque combina ingresos vinculados al valor percibido por el usuario con ingresos asociados a la intermediación efectiva de oferta y demanda. Además, reduce la dependencia de una sola fuente de monetización desde etapas tempranas.</w:t>
+      </w:r>
+      <w:r>
+        <w:rPr>
+          <w:rtl w:val="0"/>
+        </w:rPr>
+      </w:r>
+    </w:p>
+    <w:p>
+      <w:pPr>
+        <w:spacing w:after="200" w:before="0" w:line="240" w:lineRule="auto"/>
+        <w:rPr/>
+      </w:pPr>
+      <w:r>
+        <w:rPr>
+          <w:rFonts w:ascii="Calibri" w:cs="Calibri" w:eastAsia="Calibri" w:hAnsi="Calibri"/>
+          <w:b w:val="0"/>
+          <w:bCs w:val="0"/>
+          <w:i w:val="0"/>
+          <w:iCs w:val="0"/>
+          <w:color w:val="1a1a2e"/>
+          <w:sz w:val="26"/>
+          <w:szCs w:val="26"/>
+          <w:rtl w:val="0"/>
+        </w:rPr>
+        <w:t xml:space="preserve">La oportunidad de crecimiento también se apoya en una secuencia razonable. El proyecto no necesita resolver toda la complejidad del mercado habitacional desde el inicio. Puede comenzar por un segmento acotado de usuarios residenciales con intención real de construir o ampliar, validar qué tipo de salida valoran más, medir sensibilidad al precio y luego expandir gradualmente capacidades, segmentos y cobertura geográfica. Ese enfoque permite priorizar aprendizaje real por encima de promesas amplias. En términos ejecutivos, la fortaleza del proyecto no está en asumir escala inmediata, sino en demostrar que existe una fricción concreta, frecuente y suficientemente costosa como para justificar una solución integrada.</w:t>
+      </w:r>
+      <w:r>
+        <w:rPr>
+          <w:rtl w:val="0"/>
+        </w:rPr>
+      </w:r>
+    </w:p>
+    <w:p>
+      <w:pPr>
+        <w:pStyle w:val="Heading2"/>
+        <w:spacing w:line="240" w:lineRule="auto"/>
+        <w:rPr/>
+      </w:pPr>
+      <w:r>
+        <w:rPr>
+          <w:rFonts w:ascii="Calibri" w:cs="Calibri" w:eastAsia="Calibri" w:hAnsi="Calibri"/>
+          <w:b w:val="1"/>
+          <w:bCs w:val="1"/>
+          <w:color w:val="1b3a5c"/>
+          <w:sz w:val="32"/>
+          <w:szCs w:val="32"/>
+          <w:rtl w:val="0"/>
+        </w:rPr>
+        <w:t xml:space="preserve">Riesgos clave y criterio estratégico de avance</w:t>
+      </w:r>
+      <w:r>
+        <w:rPr>
+          <w:rtl w:val="0"/>
+        </w:rPr>
+      </w:r>
+    </w:p>
+    <w:p>
+      <w:pPr>
+        <w:spacing w:after="200" w:before="0" w:line="240" w:lineRule="auto"/>
+        <w:rPr/>
+      </w:pPr>
+      <w:r>
+        <w:rPr>
+          <w:rFonts w:ascii="Calibri" w:cs="Calibri" w:eastAsia="Calibri" w:hAnsi="Calibri"/>
+          <w:b w:val="0"/>
+          <w:bCs w:val="0"/>
+          <w:i w:val="0"/>
+          <w:iCs w:val="0"/>
+          <w:color w:val="1a1a2e"/>
+          <w:sz w:val="26"/>
+          <w:szCs w:val="26"/>
+          <w:rtl w:val="0"/>
+        </w:rPr>
+        <w:t xml:space="preserve">Como en todo emprendimiento de base digital con componentes de marketplace, los principales riesgos no son solo tecnológicos. HabitatIA deberá validar con rigor si los usuarios confían en una estimación preliminar como punto de partida para decidir, si perciben valor real en la propuesta antes de la ejecución de obra y si la disponibilidad de materiales sobrantes alcanza una densidad suficiente para generar oportunidades de ahorro visibles. También será importante evitar una promesa exagerada: el proyecto debe presentarse como un ordenador inteligente de decisiones iniciales, no como sustituto completo del trabajo profesional, del presupuesto ejecutivo ni de la dirección de obra.</w:t>
+      </w:r>
+      <w:r>
+        <w:rPr>
+          <w:rtl w:val="0"/>
+        </w:rPr>
+      </w:r>
+    </w:p>
+    <w:p>
+      <w:pPr>
+        <w:spacing w:after="200" w:before="0" w:line="240" w:lineRule="auto"/>
+        <w:rPr/>
+      </w:pPr>
+      <w:r>
+        <w:rPr>
+          <w:rFonts w:ascii="Calibri" w:cs="Calibri" w:eastAsia="Calibri" w:hAnsi="Calibri"/>
+          <w:b w:val="0"/>
+          <w:bCs w:val="0"/>
+          <w:i w:val="0"/>
+          <w:iCs w:val="0"/>
+          <w:color w:val="1a1a2e"/>
+          <w:sz w:val="26"/>
+          <w:szCs w:val="26"/>
+          <w:rtl w:val="0"/>
+        </w:rPr>
+        <w:t xml:space="preserve">Bajo esa condición, el criterio estratégico de avance es sólido. HabitatIA se apoya en una necesidad real, en una conducta observable de los usuarios y en una ineficiencia material que ya existe dentro del sector. Su mérito principal es reorganizar una experiencia que hoy está dispersa entre intuiciones, consultas informales, cálculos imprecisos y oportunidades de ahorro invisibles. Si logra validar que esa reorganización mejora la comprensión, acelera la toma de decisiones y genera beneficios económicos perceptibles, el proyecto tendrá base para consolidarse como una propuesta PropTech diferencial. En síntesis, HabitatIA muestra potencial no por prometer una disrupción abstracta, sino por traducir complejidad en claridad útil para un problema cotidiano y de alta sensibilidad económica.</w:t>
+      </w:r>
+      <w:r>
+        <w:rPr>
+          <w:rtl w:val="0"/>
+        </w:rPr>
+      </w:r>
+    </w:p>
+    <w:p>
+      <w:pPr>
+        <w:pStyle w:val="Heading1"/>
+        <w:spacing w:line="240" w:lineRule="auto"/>
+        <w:rPr/>
+      </w:pPr>
+      <w:r>
+        <w:rPr>
+          <w:rFonts w:ascii="Calibri" w:cs="Calibri" w:eastAsia="Calibri" w:hAnsi="Calibri"/>
+          <w:b w:val="1"/>
+          <w:bCs w:val="1"/>
           <w:i w:val="0"/>
           <w:iCs w:val="0"/>
           <w:color w:val="ffffff"/>
@@ -2111,36 +2431,36 @@
       <w:r>
         <w:rPr/>
         <w:drawing>
-          <wp:inline distB="114300" distT="114300" distL="114300" distR="114300">
-            <wp:extent cx="6933248" cy="4200525"/>
-            <wp:effectExtent b="0" l="0" r="0" t="0"/>
-            <wp:docPr id="4" name="image6.png"/>
-            <a:graphic>
-              <a:graphicData uri="http://schemas.openxmlformats.org/drawingml/2006/picture">
-                <pic:pic>
-                  <pic:nvPicPr>
-                    <pic:cNvPr id="0" name="image6.png"/>
-                    <pic:cNvPicPr preferRelativeResize="0"/>
-                  </pic:nvPicPr>
-                  <pic:blipFill>
-                    <a:blip r:embed="rId8"/>
-                    <a:srcRect b="0" l="0" r="0" t="0"/>
-                    <a:stretch>
-                      <a:fillRect/>
-                    </a:stretch>
-                  </pic:blipFill>
-                  <pic:spPr>
-                    <a:xfrm>
-                      <a:off x="0" y="0"/>
-                      <a:ext cx="6933248" cy="4200525"/>
-                    </a:xfrm>
-                    <a:prstGeom prst="rect"/>
-                    <a:ln/>
-                  </pic:spPr>
-                </pic:pic>
-              </a:graphicData>
-            </a:graphic>
-          </wp:inline>
+          <ns2:inline distB="114300" distT="114300" distL="114300" distR="114300">
+            <ns2:extent cx="6933248" cy="4200525"/>
+            <ns2:effectExtent b="0" l="0" r="0" t="0"/>
+            <ns2:docPr id="4" name="image6.png"/>
+            <ns3:graphic>
+              <ns3:graphicData uri="http://schemas.openxmlformats.org/drawingml/2006/picture">
+                <ns4:pic>
+                  <ns4:nvPicPr>
+                    <ns4:cNvPr id="0" name="image6.png"/>
+                    <ns4:cNvPicPr preferRelativeResize="0"/>
+                  </ns4:nvPicPr>
+                  <ns4:blipFill>
+                    <ns3:blip ns5:embed="rId8"/>
+                    <ns3:srcRect b="0" l="0" r="0" t="0"/>
+                    <ns3:stretch>
+                      <ns3:fillRect/>
+                    </ns3:stretch>
+                  </ns4:blipFill>
+                  <ns4:spPr>
+                    <ns3:xfrm>
+                      <ns3:off x="0" y="0"/>
+                      <ns3:ext cx="6933248" cy="4200525"/>
+                    </ns3:xfrm>
+                    <ns3:prstGeom prst="rect"/>
+                    <ns3:ln/>
+                  </ns4:spPr>
+                </ns4:pic>
+              </ns3:graphicData>
+            </ns3:graphic>
+          </ns2:inline>
         </w:drawing>
       </w:r>
       <w:r>
@@ -2208,36 +2528,36 @@
       <w:r>
         <w:rPr/>
         <w:drawing>
-          <wp:inline distB="0" distT="0" distL="0" distR="0">
-            <wp:extent cx="6119820" cy="2844800"/>
-            <wp:effectExtent b="0" l="0" r="0" t="0"/>
-            <wp:docPr id="7" name="image11.png"/>
-            <a:graphic>
-              <a:graphicData uri="http://schemas.openxmlformats.org/drawingml/2006/picture">
-                <pic:pic>
-                  <pic:nvPicPr>
-                    <pic:cNvPr id="0" name="image11.png"/>
-                    <pic:cNvPicPr preferRelativeResize="0"/>
-                  </pic:nvPicPr>
-                  <pic:blipFill>
-                    <a:blip r:embed="rId9"/>
-                    <a:srcRect b="0" l="0" r="0" t="0"/>
-                    <a:stretch>
-                      <a:fillRect/>
-                    </a:stretch>
-                  </pic:blipFill>
-                  <pic:spPr>
-                    <a:xfrm>
-                      <a:off x="0" y="0"/>
-                      <a:ext cx="6119820" cy="2844800"/>
-                    </a:xfrm>
-                    <a:prstGeom prst="rect"/>
-                    <a:ln/>
-                  </pic:spPr>
-                </pic:pic>
-              </a:graphicData>
-            </a:graphic>
-          </wp:inline>
+          <ns2:inline distB="0" distT="0" distL="0" distR="0">
+            <ns2:extent cx="6119820" cy="2844800"/>
+            <ns2:effectExtent b="0" l="0" r="0" t="0"/>
+            <ns2:docPr id="7" name="image11.png"/>
+            <ns3:graphic>
+              <ns3:graphicData uri="http://schemas.openxmlformats.org/drawingml/2006/picture">
+                <ns4:pic>
+                  <ns4:nvPicPr>
+                    <ns4:cNvPr id="0" name="image11.png"/>
+                    <ns4:cNvPicPr preferRelativeResize="0"/>
+                  </ns4:nvPicPr>
+                  <ns4:blipFill>
+                    <ns3:blip ns5:embed="rId9"/>
+                    <ns3:srcRect b="0" l="0" r="0" t="0"/>
+                    <ns3:stretch>
+                      <ns3:fillRect/>
+                    </ns3:stretch>
+                  </ns4:blipFill>
+                  <ns4:spPr>
+                    <ns3:xfrm>
+                      <ns3:off x="0" y="0"/>
+                      <ns3:ext cx="6119820" cy="2844800"/>
+                    </ns3:xfrm>
+                    <ns3:prstGeom prst="rect"/>
+                    <ns3:ln/>
+                  </ns4:spPr>
+                </ns4:pic>
+              </ns3:graphicData>
+            </ns3:graphic>
+          </ns2:inline>
         </w:drawing>
       </w:r>
       <w:r>
@@ -6421,36 +6741,36 @@
       <w:r>
         <w:rPr/>
         <w:drawing>
-          <wp:inline distB="114300" distT="114300" distL="114300" distR="114300">
-            <wp:extent cx="6119820" cy="4178300"/>
-            <wp:effectExtent b="0" l="0" r="0" t="0"/>
-            <wp:docPr id="10" name="image3.png"/>
-            <a:graphic>
-              <a:graphicData uri="http://schemas.openxmlformats.org/drawingml/2006/picture">
-                <pic:pic>
-                  <pic:nvPicPr>
-                    <pic:cNvPr id="0" name="image3.png"/>
-                    <pic:cNvPicPr preferRelativeResize="0"/>
-                  </pic:nvPicPr>
-                  <pic:blipFill>
-                    <a:blip r:embed="rId10"/>
-                    <a:srcRect b="0" l="0" r="0" t="0"/>
-                    <a:stretch>
-                      <a:fillRect/>
-                    </a:stretch>
-                  </pic:blipFill>
-                  <pic:spPr>
-                    <a:xfrm>
-                      <a:off x="0" y="0"/>
-                      <a:ext cx="6119820" cy="4178300"/>
-                    </a:xfrm>
-                    <a:prstGeom prst="rect"/>
-                    <a:ln/>
-                  </pic:spPr>
-                </pic:pic>
-              </a:graphicData>
-            </a:graphic>
-          </wp:inline>
+          <ns2:inline distB="114300" distT="114300" distL="114300" distR="114300">
+            <ns2:extent cx="6119820" cy="4178300"/>
+            <ns2:effectExtent b="0" l="0" r="0" t="0"/>
+            <ns2:docPr id="10" name="image3.png"/>
+            <ns3:graphic>
+              <ns3:graphicData uri="http://schemas.openxmlformats.org/drawingml/2006/picture">
+                <ns4:pic>
+                  <ns4:nvPicPr>
+                    <ns4:cNvPr id="0" name="image3.png"/>
+                    <ns4:cNvPicPr preferRelativeResize="0"/>
+                  </ns4:nvPicPr>
+                  <ns4:blipFill>
+                    <ns3:blip ns5:embed="rId10"/>
+                    <ns3:srcRect b="0" l="0" r="0" t="0"/>
+                    <ns3:stretch>
+                      <ns3:fillRect/>
+                    </ns3:stretch>
+                  </ns4:blipFill>
+                  <ns4:spPr>
+                    <ns3:xfrm>
+                      <ns3:off x="0" y="0"/>
+                      <ns3:ext cx="6119820" cy="4178300"/>
+                    </ns3:xfrm>
+                    <ns3:prstGeom prst="rect"/>
+                    <ns3:ln/>
+                  </ns4:spPr>
+                </ns4:pic>
+              </ns3:graphicData>
+            </ns3:graphic>
+          </ns2:inline>
         </w:drawing>
       </w:r>
       <w:r>
@@ -7288,36 +7608,36 @@
       <w:r>
         <w:rPr/>
         <w:drawing>
-          <wp:inline distB="114300" distT="114300" distL="114300" distR="114300">
-            <wp:extent cx="5543313" cy="6942773"/>
-            <wp:effectExtent b="0" l="0" r="0" t="0"/>
-            <wp:docPr id="9" name="image14.png"/>
-            <a:graphic>
-              <a:graphicData uri="http://schemas.openxmlformats.org/drawingml/2006/picture">
-                <pic:pic>
-                  <pic:nvPicPr>
-                    <pic:cNvPr id="0" name="image14.png"/>
-                    <pic:cNvPicPr preferRelativeResize="0"/>
-                  </pic:nvPicPr>
-                  <pic:blipFill>
-                    <a:blip r:embed="rId11"/>
-                    <a:srcRect b="0" l="0" r="0" t="0"/>
-                    <a:stretch>
-                      <a:fillRect/>
-                    </a:stretch>
-                  </pic:blipFill>
-                  <pic:spPr>
-                    <a:xfrm>
-                      <a:off x="0" y="0"/>
-                      <a:ext cx="5543313" cy="6942773"/>
-                    </a:xfrm>
-                    <a:prstGeom prst="rect"/>
-                    <a:ln/>
-                  </pic:spPr>
-                </pic:pic>
-              </a:graphicData>
-            </a:graphic>
-          </wp:inline>
+          <ns2:inline distB="114300" distT="114300" distL="114300" distR="114300">
+            <ns2:extent cx="5543313" cy="6942773"/>
+            <ns2:effectExtent b="0" l="0" r="0" t="0"/>
+            <ns2:docPr id="9" name="image14.png"/>
+            <ns3:graphic>
+              <ns3:graphicData uri="http://schemas.openxmlformats.org/drawingml/2006/picture">
+                <ns4:pic>
+                  <ns4:nvPicPr>
+                    <ns4:cNvPr id="0" name="image14.png"/>
+                    <ns4:cNvPicPr preferRelativeResize="0"/>
+                  </ns4:nvPicPr>
+                  <ns4:blipFill>
+                    <ns3:blip ns5:embed="rId11"/>
+                    <ns3:srcRect b="0" l="0" r="0" t="0"/>
+                    <ns3:stretch>
+                      <ns3:fillRect/>
+                    </ns3:stretch>
+                  </ns4:blipFill>
+                  <ns4:spPr>
+                    <ns3:xfrm>
+                      <ns3:off x="0" y="0"/>
+                      <ns3:ext cx="5543313" cy="6942773"/>
+                    </ns3:xfrm>
+                    <ns3:prstGeom prst="rect"/>
+                    <ns3:ln/>
+                  </ns4:spPr>
+                </ns4:pic>
+              </ns3:graphicData>
+            </ns3:graphic>
+          </ns2:inline>
         </w:drawing>
       </w:r>
       <w:r>
@@ -7501,36 +7821,36 @@
       <w:r>
         <w:rPr/>
         <w:drawing>
-          <wp:inline distB="114300" distT="114300" distL="114300" distR="114300">
-            <wp:extent cx="5914746" cy="7657148"/>
-            <wp:effectExtent b="0" l="0" r="0" t="0"/>
-            <wp:docPr id="13" name="image10.png"/>
-            <a:graphic>
-              <a:graphicData uri="http://schemas.openxmlformats.org/drawingml/2006/picture">
-                <pic:pic>
-                  <pic:nvPicPr>
-                    <pic:cNvPr id="0" name="image10.png"/>
-                    <pic:cNvPicPr preferRelativeResize="0"/>
-                  </pic:nvPicPr>
-                  <pic:blipFill>
-                    <a:blip r:embed="rId12"/>
-                    <a:srcRect b="0" l="0" r="0" t="0"/>
-                    <a:stretch>
-                      <a:fillRect/>
-                    </a:stretch>
-                  </pic:blipFill>
-                  <pic:spPr>
-                    <a:xfrm>
-                      <a:off x="0" y="0"/>
-                      <a:ext cx="5914746" cy="7657148"/>
-                    </a:xfrm>
-                    <a:prstGeom prst="rect"/>
-                    <a:ln/>
-                  </pic:spPr>
-                </pic:pic>
-              </a:graphicData>
-            </a:graphic>
-          </wp:inline>
+          <ns2:inline distB="114300" distT="114300" distL="114300" distR="114300">
+            <ns2:extent cx="5914746" cy="7657148"/>
+            <ns2:effectExtent b="0" l="0" r="0" t="0"/>
+            <ns2:docPr id="13" name="image10.png"/>
+            <ns3:graphic>
+              <ns3:graphicData uri="http://schemas.openxmlformats.org/drawingml/2006/picture">
+                <ns4:pic>
+                  <ns4:nvPicPr>
+                    <ns4:cNvPr id="0" name="image10.png"/>
+                    <ns4:cNvPicPr preferRelativeResize="0"/>
+                  </ns4:nvPicPr>
+                  <ns4:blipFill>
+                    <ns3:blip ns5:embed="rId12"/>
+                    <ns3:srcRect b="0" l="0" r="0" t="0"/>
+                    <ns3:stretch>
+                      <ns3:fillRect/>
+                    </ns3:stretch>
+                  </ns4:blipFill>
+                  <ns4:spPr>
+                    <ns3:xfrm>
+                      <ns3:off x="0" y="0"/>
+                      <ns3:ext cx="5914746" cy="7657148"/>
+                    </ns3:xfrm>
+                    <ns3:prstGeom prst="rect"/>
+                    <ns3:ln/>
+                  </ns4:spPr>
+                </ns4:pic>
+              </ns3:graphicData>
+            </ns3:graphic>
+          </ns2:inline>
         </w:drawing>
       </w:r>
       <w:r>
@@ -10041,36 +10361,36 @@
       <w:r>
         <w:rPr/>
         <w:drawing>
-          <wp:inline distB="0" distT="0" distL="0" distR="0">
-            <wp:extent cx="6119820" cy="3441700"/>
-            <wp:effectExtent b="0" l="0" r="0" t="0"/>
-            <wp:docPr id="11" name="image9.png"/>
-            <a:graphic>
-              <a:graphicData uri="http://schemas.openxmlformats.org/drawingml/2006/picture">
-                <pic:pic>
-                  <pic:nvPicPr>
-                    <pic:cNvPr id="0" name="image9.png"/>
-                    <pic:cNvPicPr preferRelativeResize="0"/>
-                  </pic:nvPicPr>
-                  <pic:blipFill>
-                    <a:blip r:embed="rId13"/>
-                    <a:srcRect b="0" l="0" r="0" t="0"/>
-                    <a:stretch>
-                      <a:fillRect/>
-                    </a:stretch>
-                  </pic:blipFill>
-                  <pic:spPr>
-                    <a:xfrm>
-                      <a:off x="0" y="0"/>
-                      <a:ext cx="6119820" cy="3441700"/>
-                    </a:xfrm>
-                    <a:prstGeom prst="rect"/>
-                    <a:ln/>
-                  </pic:spPr>
-                </pic:pic>
-              </a:graphicData>
-            </a:graphic>
-          </wp:inline>
+          <ns2:inline distB="0" distT="0" distL="0" distR="0">
+            <ns2:extent cx="6119820" cy="3441700"/>
+            <ns2:effectExtent b="0" l="0" r="0" t="0"/>
+            <ns2:docPr id="11" name="image9.png"/>
+            <ns3:graphic>
+              <ns3:graphicData uri="http://schemas.openxmlformats.org/drawingml/2006/picture">
+                <ns4:pic>
+                  <ns4:nvPicPr>
+                    <ns4:cNvPr id="0" name="image9.png"/>
+                    <ns4:cNvPicPr preferRelativeResize="0"/>
+                  </ns4:nvPicPr>
+                  <ns4:blipFill>
+                    <ns3:blip ns5:embed="rId13"/>
+                    <ns3:srcRect b="0" l="0" r="0" t="0"/>
+                    <ns3:stretch>
+                      <ns3:fillRect/>
+                    </ns3:stretch>
+                  </ns4:blipFill>
+                  <ns4:spPr>
+                    <ns3:xfrm>
+                      <ns3:off x="0" y="0"/>
+                      <ns3:ext cx="6119820" cy="3441700"/>
+                    </ns3:xfrm>
+                    <ns3:prstGeom prst="rect"/>
+                    <ns3:ln/>
+                  </ns4:spPr>
+                </ns4:pic>
+              </ns3:graphicData>
+            </ns3:graphic>
+          </ns2:inline>
         </w:drawing>
       </w:r>
       <w:r>
@@ -10630,36 +10950,36 @@
       <w:r>
         <w:rPr/>
         <w:drawing>
-          <wp:inline distB="114300" distT="114300" distL="114300" distR="114300">
-            <wp:extent cx="6119820" cy="5765800"/>
-            <wp:effectExtent b="0" l="0" r="0" t="0"/>
-            <wp:docPr id="1" name="image19.png"/>
-            <a:graphic>
-              <a:graphicData uri="http://schemas.openxmlformats.org/drawingml/2006/picture">
-                <pic:pic>
-                  <pic:nvPicPr>
-                    <pic:cNvPr id="0" name="image19.png"/>
-                    <pic:cNvPicPr preferRelativeResize="0"/>
-                  </pic:nvPicPr>
-                  <pic:blipFill>
-                    <a:blip r:embed="rId14"/>
-                    <a:srcRect b="0" l="0" r="0" t="0"/>
-                    <a:stretch>
-                      <a:fillRect/>
-                    </a:stretch>
-                  </pic:blipFill>
-                  <pic:spPr>
-                    <a:xfrm>
-                      <a:off x="0" y="0"/>
-                      <a:ext cx="6119820" cy="5765800"/>
-                    </a:xfrm>
-                    <a:prstGeom prst="rect"/>
-                    <a:ln/>
-                  </pic:spPr>
-                </pic:pic>
-              </a:graphicData>
-            </a:graphic>
-          </wp:inline>
+          <ns2:inline distB="114300" distT="114300" distL="114300" distR="114300">
+            <ns2:extent cx="6119820" cy="5765800"/>
+            <ns2:effectExtent b="0" l="0" r="0" t="0"/>
+            <ns2:docPr id="1" name="image19.png"/>
+            <ns3:graphic>
+              <ns3:graphicData uri="http://schemas.openxmlformats.org/drawingml/2006/picture">
+                <ns4:pic>
+                  <ns4:nvPicPr>
+                    <ns4:cNvPr id="0" name="image19.png"/>
+                    <ns4:cNvPicPr preferRelativeResize="0"/>
+                  </ns4:nvPicPr>
+                  <ns4:blipFill>
+                    <ns3:blip ns5:embed="rId14"/>
+                    <ns3:srcRect b="0" l="0" r="0" t="0"/>
+                    <ns3:stretch>
+                      <ns3:fillRect/>
+                    </ns3:stretch>
+                  </ns4:blipFill>
+                  <ns4:spPr>
+                    <ns3:xfrm>
+                      <ns3:off x="0" y="0"/>
+                      <ns3:ext cx="6119820" cy="5765800"/>
+                    </ns3:xfrm>
+                    <ns3:prstGeom prst="rect"/>
+                    <ns3:ln/>
+                  </ns4:spPr>
+                </ns4:pic>
+              </ns3:graphicData>
+            </ns3:graphic>
+          </ns2:inline>
         </w:drawing>
       </w:r>
       <w:r>
@@ -10842,36 +11162,36 @@
           <w:szCs w:val="26"/>
         </w:rPr>
         <w:drawing>
-          <wp:inline distB="114300" distT="114300" distL="114300" distR="114300">
-            <wp:extent cx="6119820" cy="4775200"/>
-            <wp:effectExtent b="0" l="0" r="0" t="0"/>
-            <wp:docPr id="3" name="image18.png"/>
-            <a:graphic>
-              <a:graphicData uri="http://schemas.openxmlformats.org/drawingml/2006/picture">
-                <pic:pic>
-                  <pic:nvPicPr>
-                    <pic:cNvPr id="0" name="image18.png"/>
-                    <pic:cNvPicPr preferRelativeResize="0"/>
-                  </pic:nvPicPr>
-                  <pic:blipFill>
-                    <a:blip r:embed="rId15"/>
-                    <a:srcRect b="0" l="0" r="0" t="0"/>
-                    <a:stretch>
-                      <a:fillRect/>
-                    </a:stretch>
-                  </pic:blipFill>
-                  <pic:spPr>
-                    <a:xfrm>
-                      <a:off x="0" y="0"/>
-                      <a:ext cx="6119820" cy="4775200"/>
-                    </a:xfrm>
-                    <a:prstGeom prst="rect"/>
-                    <a:ln/>
-                  </pic:spPr>
-                </pic:pic>
-              </a:graphicData>
-            </a:graphic>
-          </wp:inline>
+          <ns2:inline distB="114300" distT="114300" distL="114300" distR="114300">
+            <ns2:extent cx="6119820" cy="4775200"/>
+            <ns2:effectExtent b="0" l="0" r="0" t="0"/>
+            <ns2:docPr id="3" name="image18.png"/>
+            <ns3:graphic>
+              <ns3:graphicData uri="http://schemas.openxmlformats.org/drawingml/2006/picture">
+                <ns4:pic>
+                  <ns4:nvPicPr>
+                    <ns4:cNvPr id="0" name="image18.png"/>
+                    <ns4:cNvPicPr preferRelativeResize="0"/>
+                  </ns4:nvPicPr>
+                  <ns4:blipFill>
+                    <ns3:blip ns5:embed="rId15"/>
+                    <ns3:srcRect b="0" l="0" r="0" t="0"/>
+                    <ns3:stretch>
+                      <ns3:fillRect/>
+                    </ns3:stretch>
+                  </ns4:blipFill>
+                  <ns4:spPr>
+                    <ns3:xfrm>
+                      <ns3:off x="0" y="0"/>
+                      <ns3:ext cx="6119820" cy="4775200"/>
+                    </ns3:xfrm>
+                    <ns3:prstGeom prst="rect"/>
+                    <ns3:ln/>
+                  </ns4:spPr>
+                </ns4:pic>
+              </ns3:graphicData>
+            </ns3:graphic>
+          </ns2:inline>
         </w:drawing>
       </w:r>
       <w:r>
@@ -10974,36 +11294,36 @@
           <w:szCs w:val="26"/>
         </w:rPr>
         <w:drawing>
-          <wp:inline distB="114300" distT="114300" distL="114300" distR="114300">
-            <wp:extent cx="6119820" cy="5092700"/>
-            <wp:effectExtent b="0" l="0" r="0" t="0"/>
-            <wp:docPr id="12" name="image17.png"/>
-            <a:graphic>
-              <a:graphicData uri="http://schemas.openxmlformats.org/drawingml/2006/picture">
-                <pic:pic>
-                  <pic:nvPicPr>
-                    <pic:cNvPr id="0" name="image17.png"/>
-                    <pic:cNvPicPr preferRelativeResize="0"/>
-                  </pic:nvPicPr>
-                  <pic:blipFill>
-                    <a:blip r:embed="rId16"/>
-                    <a:srcRect b="0" l="0" r="0" t="0"/>
-                    <a:stretch>
-                      <a:fillRect/>
-                    </a:stretch>
-                  </pic:blipFill>
-                  <pic:spPr>
-                    <a:xfrm>
-                      <a:off x="0" y="0"/>
-                      <a:ext cx="6119820" cy="5092700"/>
-                    </a:xfrm>
-                    <a:prstGeom prst="rect"/>
-                    <a:ln/>
-                  </pic:spPr>
-                </pic:pic>
-              </a:graphicData>
-            </a:graphic>
-          </wp:inline>
+          <ns2:inline distB="114300" distT="114300" distL="114300" distR="114300">
+            <ns2:extent cx="6119820" cy="5092700"/>
+            <ns2:effectExtent b="0" l="0" r="0" t="0"/>
+            <ns2:docPr id="12" name="image17.png"/>
+            <ns3:graphic>
+              <ns3:graphicData uri="http://schemas.openxmlformats.org/drawingml/2006/picture">
+                <ns4:pic>
+                  <ns4:nvPicPr>
+                    <ns4:cNvPr id="0" name="image17.png"/>
+                    <ns4:cNvPicPr preferRelativeResize="0"/>
+                  </ns4:nvPicPr>
+                  <ns4:blipFill>
+                    <ns3:blip ns5:embed="rId16"/>
+                    <ns3:srcRect b="0" l="0" r="0" t="0"/>
+                    <ns3:stretch>
+                      <ns3:fillRect/>
+                    </ns3:stretch>
+                  </ns4:blipFill>
+                  <ns4:spPr>
+                    <ns3:xfrm>
+                      <ns3:off x="0" y="0"/>
+                      <ns3:ext cx="6119820" cy="5092700"/>
+                    </ns3:xfrm>
+                    <ns3:prstGeom prst="rect"/>
+                    <ns3:ln/>
+                  </ns4:spPr>
+                </ns4:pic>
+              </ns3:graphicData>
+            </ns3:graphic>
+          </ns2:inline>
         </w:drawing>
       </w:r>
       <w:r>
@@ -11076,36 +11396,36 @@
       <w:r>
         <w:rPr/>
         <w:drawing>
-          <wp:inline distB="0" distT="0" distL="0" distR="0">
-            <wp:extent cx="5973600" cy="3691551"/>
-            <wp:effectExtent b="0" l="0" r="0" t="0"/>
-            <wp:docPr id="15" name="image16.png"/>
-            <a:graphic>
-              <a:graphicData uri="http://schemas.openxmlformats.org/drawingml/2006/picture">
-                <pic:pic>
-                  <pic:nvPicPr>
-                    <pic:cNvPr id="0" name="image16.png"/>
-                    <pic:cNvPicPr preferRelativeResize="0"/>
-                  </pic:nvPicPr>
-                  <pic:blipFill>
-                    <a:blip r:embed="rId17"/>
-                    <a:srcRect b="0" l="0" r="0" t="0"/>
-                    <a:stretch>
-                      <a:fillRect/>
-                    </a:stretch>
-                  </pic:blipFill>
-                  <pic:spPr>
-                    <a:xfrm>
-                      <a:off x="0" y="0"/>
-                      <a:ext cx="5973600" cy="3691551"/>
-                    </a:xfrm>
-                    <a:prstGeom prst="rect"/>
-                    <a:ln/>
-                  </pic:spPr>
-                </pic:pic>
-              </a:graphicData>
-            </a:graphic>
-          </wp:inline>
+          <ns2:inline distB="0" distT="0" distL="0" distR="0">
+            <ns2:extent cx="5973600" cy="3691551"/>
+            <ns2:effectExtent b="0" l="0" r="0" t="0"/>
+            <ns2:docPr id="15" name="image16.png"/>
+            <ns3:graphic>
+              <ns3:graphicData uri="http://schemas.openxmlformats.org/drawingml/2006/picture">
+                <ns4:pic>
+                  <ns4:nvPicPr>
+                    <ns4:cNvPr id="0" name="image16.png"/>
+                    <ns4:cNvPicPr preferRelativeResize="0"/>
+                  </ns4:nvPicPr>
+                  <ns4:blipFill>
+                    <ns3:blip ns5:embed="rId17"/>
+                    <ns3:srcRect b="0" l="0" r="0" t="0"/>
+                    <ns3:stretch>
+                      <ns3:fillRect/>
+                    </ns3:stretch>
+                  </ns4:blipFill>
+                  <ns4:spPr>
+                    <ns3:xfrm>
+                      <ns3:off x="0" y="0"/>
+                      <ns3:ext cx="5973600" cy="3691551"/>
+                    </ns3:xfrm>
+                    <ns3:prstGeom prst="rect"/>
+                    <ns3:ln/>
+                  </ns4:spPr>
+                </ns4:pic>
+              </ns3:graphicData>
+            </ns3:graphic>
+          </ns2:inline>
         </w:drawing>
       </w:r>
       <w:r>
@@ -14673,36 +14993,36 @@
       <w:r>
         <w:rPr/>
         <w:drawing>
-          <wp:inline distB="114300" distT="114300" distL="114300" distR="114300">
-            <wp:extent cx="6124575" cy="2958802"/>
-            <wp:effectExtent b="0" l="0" r="0" t="0"/>
-            <wp:docPr id="14" name="image15.png"/>
-            <a:graphic>
-              <a:graphicData uri="http://schemas.openxmlformats.org/drawingml/2006/picture">
-                <pic:pic>
-                  <pic:nvPicPr>
-                    <pic:cNvPr id="0" name="image15.png"/>
-                    <pic:cNvPicPr preferRelativeResize="0"/>
-                  </pic:nvPicPr>
-                  <pic:blipFill>
-                    <a:blip r:embed="rId18"/>
-                    <a:srcRect b="0" l="0" r="0" t="2008"/>
-                    <a:stretch>
-                      <a:fillRect/>
-                    </a:stretch>
-                  </pic:blipFill>
-                  <pic:spPr>
-                    <a:xfrm>
-                      <a:off x="0" y="0"/>
-                      <a:ext cx="6124575" cy="2958802"/>
-                    </a:xfrm>
-                    <a:prstGeom prst="rect"/>
-                    <a:ln/>
-                  </pic:spPr>
-                </pic:pic>
-              </a:graphicData>
-            </a:graphic>
-          </wp:inline>
+          <ns2:inline distB="114300" distT="114300" distL="114300" distR="114300">
+            <ns2:extent cx="6124575" cy="2958802"/>
+            <ns2:effectExtent b="0" l="0" r="0" t="0"/>
+            <ns2:docPr id="14" name="image15.png"/>
+            <ns3:graphic>
+              <ns3:graphicData uri="http://schemas.openxmlformats.org/drawingml/2006/picture">
+                <ns4:pic>
+                  <ns4:nvPicPr>
+                    <ns4:cNvPr id="0" name="image15.png"/>
+                    <ns4:cNvPicPr preferRelativeResize="0"/>
+                  </ns4:nvPicPr>
+                  <ns4:blipFill>
+                    <ns3:blip ns5:embed="rId18"/>
+                    <ns3:srcRect b="0" l="0" r="0" t="2008"/>
+                    <ns3:stretch>
+                      <ns3:fillRect/>
+                    </ns3:stretch>
+                  </ns4:blipFill>
+                  <ns4:spPr>
+                    <ns3:xfrm>
+                      <ns3:off x="0" y="0"/>
+                      <ns3:ext cx="6124575" cy="2958802"/>
+                    </ns3:xfrm>
+                    <ns3:prstGeom prst="rect"/>
+                    <ns3:ln/>
+                  </ns4:spPr>
+                </ns4:pic>
+              </ns3:graphicData>
+            </ns3:graphic>
+          </ns2:inline>
         </w:drawing>
       </w:r>
       <w:r>
@@ -17059,36 +17379,36 @@
       <w:r>
         <w:rPr/>
         <w:drawing>
-          <wp:inline distB="0" distT="0" distL="0" distR="0">
-            <wp:extent cx="6119820" cy="2857500"/>
-            <wp:effectExtent b="0" l="0" r="0" t="0"/>
-            <wp:docPr id="18" name="image4.png"/>
-            <a:graphic>
-              <a:graphicData uri="http://schemas.openxmlformats.org/drawingml/2006/picture">
-                <pic:pic>
-                  <pic:nvPicPr>
-                    <pic:cNvPr id="0" name="image4.png"/>
-                    <pic:cNvPicPr preferRelativeResize="0"/>
-                  </pic:nvPicPr>
-                  <pic:blipFill>
-                    <a:blip r:embed="rId19"/>
-                    <a:srcRect b="0" l="0" r="0" t="0"/>
-                    <a:stretch>
-                      <a:fillRect/>
-                    </a:stretch>
-                  </pic:blipFill>
-                  <pic:spPr>
-                    <a:xfrm>
-                      <a:off x="0" y="0"/>
-                      <a:ext cx="6119820" cy="2857500"/>
-                    </a:xfrm>
-                    <a:prstGeom prst="rect"/>
-                    <a:ln/>
-                  </pic:spPr>
-                </pic:pic>
-              </a:graphicData>
-            </a:graphic>
-          </wp:inline>
+          <ns2:inline distB="0" distT="0" distL="0" distR="0">
+            <ns2:extent cx="6119820" cy="2857500"/>
+            <ns2:effectExtent b="0" l="0" r="0" t="0"/>
+            <ns2:docPr id="18" name="image4.png"/>
+            <ns3:graphic>
+              <ns3:graphicData uri="http://schemas.openxmlformats.org/drawingml/2006/picture">
+                <ns4:pic>
+                  <ns4:nvPicPr>
+                    <ns4:cNvPr id="0" name="image4.png"/>
+                    <ns4:cNvPicPr preferRelativeResize="0"/>
+                  </ns4:nvPicPr>
+                  <ns4:blipFill>
+                    <ns3:blip ns5:embed="rId19"/>
+                    <ns3:srcRect b="0" l="0" r="0" t="0"/>
+                    <ns3:stretch>
+                      <ns3:fillRect/>
+                    </ns3:stretch>
+                  </ns4:blipFill>
+                  <ns4:spPr>
+                    <ns3:xfrm>
+                      <ns3:off x="0" y="0"/>
+                      <ns3:ext cx="6119820" cy="2857500"/>
+                    </ns3:xfrm>
+                    <ns3:prstGeom prst="rect"/>
+                    <ns3:ln/>
+                  </ns4:spPr>
+                </ns4:pic>
+              </ns3:graphicData>
+            </ns3:graphic>
+          </ns2:inline>
         </w:drawing>
       </w:r>
       <w:r>
@@ -19412,36 +19732,36 @@
       <w:r>
         <w:rPr/>
         <w:drawing>
-          <wp:inline distB="114300" distT="114300" distL="114300" distR="114300">
-            <wp:extent cx="6119820" cy="3733800"/>
-            <wp:effectExtent b="0" l="0" r="0" t="0"/>
-            <wp:docPr id="5" name="image7.png"/>
-            <a:graphic>
-              <a:graphicData uri="http://schemas.openxmlformats.org/drawingml/2006/picture">
-                <pic:pic>
-                  <pic:nvPicPr>
-                    <pic:cNvPr id="0" name="image7.png"/>
-                    <pic:cNvPicPr preferRelativeResize="0"/>
-                  </pic:nvPicPr>
-                  <pic:blipFill>
-                    <a:blip r:embed="rId20"/>
-                    <a:srcRect b="0" l="0" r="0" t="0"/>
-                    <a:stretch>
-                      <a:fillRect/>
-                    </a:stretch>
-                  </pic:blipFill>
-                  <pic:spPr>
-                    <a:xfrm>
-                      <a:off x="0" y="0"/>
-                      <a:ext cx="6119820" cy="3733800"/>
-                    </a:xfrm>
-                    <a:prstGeom prst="rect"/>
-                    <a:ln/>
-                  </pic:spPr>
-                </pic:pic>
-              </a:graphicData>
-            </a:graphic>
-          </wp:inline>
+          <ns2:inline distB="114300" distT="114300" distL="114300" distR="114300">
+            <ns2:extent cx="6119820" cy="3733800"/>
+            <ns2:effectExtent b="0" l="0" r="0" t="0"/>
+            <ns2:docPr id="5" name="image7.png"/>
+            <ns3:graphic>
+              <ns3:graphicData uri="http://schemas.openxmlformats.org/drawingml/2006/picture">
+                <ns4:pic>
+                  <ns4:nvPicPr>
+                    <ns4:cNvPr id="0" name="image7.png"/>
+                    <ns4:cNvPicPr preferRelativeResize="0"/>
+                  </ns4:nvPicPr>
+                  <ns4:blipFill>
+                    <ns3:blip ns5:embed="rId20"/>
+                    <ns3:srcRect b="0" l="0" r="0" t="0"/>
+                    <ns3:stretch>
+                      <ns3:fillRect/>
+                    </ns3:stretch>
+                  </ns4:blipFill>
+                  <ns4:spPr>
+                    <ns3:xfrm>
+                      <ns3:off x="0" y="0"/>
+                      <ns3:ext cx="6119820" cy="3733800"/>
+                    </ns3:xfrm>
+                    <ns3:prstGeom prst="rect"/>
+                    <ns3:ln/>
+                  </ns4:spPr>
+                </ns4:pic>
+              </ns3:graphicData>
+            </ns3:graphic>
+          </ns2:inline>
         </w:drawing>
       </w:r>
       <w:r>
@@ -19458,36 +19778,36 @@
       <w:r>
         <w:rPr/>
         <w:drawing>
-          <wp:inline distB="114300" distT="114300" distL="114300" distR="114300">
-            <wp:extent cx="6119820" cy="5892800"/>
-            <wp:effectExtent b="0" l="0" r="0" t="0"/>
-            <wp:docPr id="8" name="image8.png"/>
-            <a:graphic>
-              <a:graphicData uri="http://schemas.openxmlformats.org/drawingml/2006/picture">
-                <pic:pic>
-                  <pic:nvPicPr>
-                    <pic:cNvPr id="0" name="image8.png"/>
-                    <pic:cNvPicPr preferRelativeResize="0"/>
-                  </pic:nvPicPr>
-                  <pic:blipFill>
-                    <a:blip r:embed="rId21"/>
-                    <a:srcRect b="0" l="0" r="0" t="0"/>
-                    <a:stretch>
-                      <a:fillRect/>
-                    </a:stretch>
-                  </pic:blipFill>
-                  <pic:spPr>
-                    <a:xfrm>
-                      <a:off x="0" y="0"/>
-                      <a:ext cx="6119820" cy="5892800"/>
-                    </a:xfrm>
-                    <a:prstGeom prst="rect"/>
-                    <a:ln/>
-                  </pic:spPr>
-                </pic:pic>
-              </a:graphicData>
-            </a:graphic>
-          </wp:inline>
+          <ns2:inline distB="114300" distT="114300" distL="114300" distR="114300">
+            <ns2:extent cx="6119820" cy="5892800"/>
+            <ns2:effectExtent b="0" l="0" r="0" t="0"/>
+            <ns2:docPr id="8" name="image8.png"/>
+            <ns3:graphic>
+              <ns3:graphicData uri="http://schemas.openxmlformats.org/drawingml/2006/picture">
+                <ns4:pic>
+                  <ns4:nvPicPr>
+                    <ns4:cNvPr id="0" name="image8.png"/>
+                    <ns4:cNvPicPr preferRelativeResize="0"/>
+                  </ns4:nvPicPr>
+                  <ns4:blipFill>
+                    <ns3:blip ns5:embed="rId21"/>
+                    <ns3:srcRect b="0" l="0" r="0" t="0"/>
+                    <ns3:stretch>
+                      <ns3:fillRect/>
+                    </ns3:stretch>
+                  </ns4:blipFill>
+                  <ns4:spPr>
+                    <ns3:xfrm>
+                      <ns3:off x="0" y="0"/>
+                      <ns3:ext cx="6119820" cy="5892800"/>
+                    </ns3:xfrm>
+                    <ns3:prstGeom prst="rect"/>
+                    <ns3:ln/>
+                  </ns4:spPr>
+                </ns4:pic>
+              </ns3:graphicData>
+            </ns3:graphic>
+          </ns2:inline>
         </w:drawing>
       </w:r>
       <w:r>
@@ -26284,36 +26604,36 @@
       <w:r>
         <w:rPr/>
         <w:drawing>
-          <wp:inline distB="0" distT="0" distL="0" distR="0">
-            <wp:extent cx="6119820" cy="3263900"/>
-            <wp:effectExtent b="0" l="0" r="0" t="0"/>
-            <wp:docPr id="16" name="image1.png"/>
-            <a:graphic>
-              <a:graphicData uri="http://schemas.openxmlformats.org/drawingml/2006/picture">
-                <pic:pic>
-                  <pic:nvPicPr>
-                    <pic:cNvPr id="0" name="image1.png"/>
-                    <pic:cNvPicPr preferRelativeResize="0"/>
-                  </pic:nvPicPr>
-                  <pic:blipFill>
-                    <a:blip r:embed="rId22"/>
-                    <a:srcRect b="0" l="0" r="0" t="0"/>
-                    <a:stretch>
-                      <a:fillRect/>
-                    </a:stretch>
-                  </pic:blipFill>
-                  <pic:spPr>
-                    <a:xfrm>
-                      <a:off x="0" y="0"/>
-                      <a:ext cx="6119820" cy="3263900"/>
-                    </a:xfrm>
-                    <a:prstGeom prst="rect"/>
-                    <a:ln/>
-                  </pic:spPr>
-                </pic:pic>
-              </a:graphicData>
-            </a:graphic>
-          </wp:inline>
+          <ns2:inline distB="0" distT="0" distL="0" distR="0">
+            <ns2:extent cx="6119820" cy="3263900"/>
+            <ns2:effectExtent b="0" l="0" r="0" t="0"/>
+            <ns2:docPr id="16" name="image1.png"/>
+            <ns3:graphic>
+              <ns3:graphicData uri="http://schemas.openxmlformats.org/drawingml/2006/picture">
+                <ns4:pic>
+                  <ns4:nvPicPr>
+                    <ns4:cNvPr id="0" name="image1.png"/>
+                    <ns4:cNvPicPr preferRelativeResize="0"/>
+                  </ns4:nvPicPr>
+                  <ns4:blipFill>
+                    <ns3:blip ns5:embed="rId22"/>
+                    <ns3:srcRect b="0" l="0" r="0" t="0"/>
+                    <ns3:stretch>
+                      <ns3:fillRect/>
+                    </ns3:stretch>
+                  </ns4:blipFill>
+                  <ns4:spPr>
+                    <ns3:xfrm>
+                      <ns3:off x="0" y="0"/>
+                      <ns3:ext cx="6119820" cy="3263900"/>
+                    </ns3:xfrm>
+                    <ns3:prstGeom prst="rect"/>
+                    <ns3:ln/>
+                  </ns4:spPr>
+                </ns4:pic>
+              </ns3:graphicData>
+            </ns3:graphic>
+          </ns2:inline>
         </w:drawing>
       </w:r>
       <w:r>
@@ -26501,36 +26821,36 @@
       <w:r>
         <w:rPr/>
         <w:drawing>
-          <wp:inline distB="0" distT="0" distL="0" distR="0">
-            <wp:extent cx="6119820" cy="3124200"/>
-            <wp:effectExtent b="0" l="0" r="0" t="0"/>
-            <wp:docPr id="17" name="image2.png"/>
-            <a:graphic>
-              <a:graphicData uri="http://schemas.openxmlformats.org/drawingml/2006/picture">
-                <pic:pic>
-                  <pic:nvPicPr>
-                    <pic:cNvPr id="0" name="image2.png"/>
-                    <pic:cNvPicPr preferRelativeResize="0"/>
-                  </pic:nvPicPr>
-                  <pic:blipFill>
-                    <a:blip r:embed="rId23"/>
-                    <a:srcRect b="0" l="0" r="0" t="0"/>
-                    <a:stretch>
-                      <a:fillRect/>
-                    </a:stretch>
-                  </pic:blipFill>
-                  <pic:spPr>
-                    <a:xfrm>
-                      <a:off x="0" y="0"/>
-                      <a:ext cx="6119820" cy="3124200"/>
-                    </a:xfrm>
-                    <a:prstGeom prst="rect"/>
-                    <a:ln/>
-                  </pic:spPr>
-                </pic:pic>
-              </a:graphicData>
-            </a:graphic>
-          </wp:inline>
+          <ns2:inline distB="0" distT="0" distL="0" distR="0">
+            <ns2:extent cx="6119820" cy="3124200"/>
+            <ns2:effectExtent b="0" l="0" r="0" t="0"/>
+            <ns2:docPr id="17" name="image2.png"/>
+            <ns3:graphic>
+              <ns3:graphicData uri="http://schemas.openxmlformats.org/drawingml/2006/picture">
+                <ns4:pic>
+                  <ns4:nvPicPr>
+                    <ns4:cNvPr id="0" name="image2.png"/>
+                    <ns4:cNvPicPr preferRelativeResize="0"/>
+                  </ns4:nvPicPr>
+                  <ns4:blipFill>
+                    <ns3:blip ns5:embed="rId23"/>
+                    <ns3:srcRect b="0" l="0" r="0" t="0"/>
+                    <ns3:stretch>
+                      <ns3:fillRect/>
+                    </ns3:stretch>
+                  </ns4:blipFill>
+                  <ns4:spPr>
+                    <ns3:xfrm>
+                      <ns3:off x="0" y="0"/>
+                      <ns3:ext cx="6119820" cy="3124200"/>
+                    </ns3:xfrm>
+                    <ns3:prstGeom prst="rect"/>
+                    <ns3:ln/>
+                  </ns4:spPr>
+                </ns4:pic>
+              </ns3:graphicData>
+            </ns3:graphic>
+          </ns2:inline>
         </w:drawing>
       </w:r>
       <w:r>
@@ -31505,7 +31825,7 @@
           <w:bCs w:val="1"/>
         </w:rPr>
       </w:pPr>
-      <w:hyperlink r:id="rId24">
+      <w:hyperlink ns5:id="rId24">
         <w:r>
           <w:rPr>
             <w:b w:val="1"/>
@@ -31553,36 +31873,36 @@
           <w:szCs w:val="32"/>
         </w:rPr>
         <w:drawing>
-          <wp:inline distB="114300" distT="114300" distL="114300" distR="114300">
-            <wp:extent cx="6119820" cy="5105400"/>
-            <wp:effectExtent b="0" l="0" r="0" t="0"/>
-            <wp:docPr id="2" name="image12.png"/>
-            <a:graphic>
-              <a:graphicData uri="http://schemas.openxmlformats.org/drawingml/2006/picture">
-                <pic:pic>
-                  <pic:nvPicPr>
-                    <pic:cNvPr id="0" name="image12.png"/>
-                    <pic:cNvPicPr preferRelativeResize="0"/>
-                  </pic:nvPicPr>
-                  <pic:blipFill>
-                    <a:blip r:embed="rId25"/>
-                    <a:srcRect b="0" l="0" r="0" t="0"/>
-                    <a:stretch>
-                      <a:fillRect/>
-                    </a:stretch>
-                  </pic:blipFill>
-                  <pic:spPr>
-                    <a:xfrm>
-                      <a:off x="0" y="0"/>
-                      <a:ext cx="6119820" cy="5105400"/>
-                    </a:xfrm>
-                    <a:prstGeom prst="rect"/>
-                    <a:ln/>
-                  </pic:spPr>
-                </pic:pic>
-              </a:graphicData>
-            </a:graphic>
-          </wp:inline>
+          <ns2:inline distB="114300" distT="114300" distL="114300" distR="114300">
+            <ns2:extent cx="6119820" cy="5105400"/>
+            <ns2:effectExtent b="0" l="0" r="0" t="0"/>
+            <ns2:docPr id="2" name="image12.png"/>
+            <ns3:graphic>
+              <ns3:graphicData uri="http://schemas.openxmlformats.org/drawingml/2006/picture">
+                <ns4:pic>
+                  <ns4:nvPicPr>
+                    <ns4:cNvPr id="0" name="image12.png"/>
+                    <ns4:cNvPicPr preferRelativeResize="0"/>
+                  </ns4:nvPicPr>
+                  <ns4:blipFill>
+                    <ns3:blip ns5:embed="rId25"/>
+                    <ns3:srcRect b="0" l="0" r="0" t="0"/>
+                    <ns3:stretch>
+                      <ns3:fillRect/>
+                    </ns3:stretch>
+                  </ns4:blipFill>
+                  <ns4:spPr>
+                    <ns3:xfrm>
+                      <ns3:off x="0" y="0"/>
+                      <ns3:ext cx="6119820" cy="5105400"/>
+                    </ns3:xfrm>
+                    <ns3:prstGeom prst="rect"/>
+                    <ns3:ln/>
+                  </ns4:spPr>
+                </ns4:pic>
+              </ns3:graphicData>
+            </ns3:graphic>
+          </ns2:inline>
         </w:drawing>
       </w:r>
       <w:r>
@@ -31720,8 +32040,8 @@
       </w:r>
     </w:p>
     <w:sectPr>
-      <w:headerReference r:id="rId26" w:type="default"/>
-      <w:footerReference w:type="default" r:id="rId27"/>
+      <w:headerReference ns5:id="rId26" w:type="default"/>
+      <w:footerReference w:type="default" ns5:id="rId27"/>
       <w:pgSz w:h="16838" w:w="11906" w:orient="portrait"/>
       <w:pgMar w:bottom="1134" w:top="1134" w:left="1134" w:right="1134" w:header="708" w:footer="708"/>
       <w:pgNumType w:start="1"/>

</xml_diff>